<commit_message>
fix: grup numarasi 12 olarak duzeltildi (kapak + README + API + metadata); rapor/sunum PDF dosyalari repoya eklendi
</commit_message>
<xml_diff>
--- a/sunum/Guvenli_Surus_Proje_Raporu.docx
+++ b/sunum/Guvenli_Surus_Proje_Raporu.docx
@@ -80,7 +80,7 @@
     </w:p>
     <w:p>
       <w:pPr>
-        <w:spacing w:after="700"/>
+        <w:spacing w:after="360"/>
         <w:jc w:val="center"/>
       </w:pPr>
       <w:r>
@@ -92,6 +92,22 @@
           <w:szCs w:val="24"/>
         </w:rPr>
         <w:t xml:space="preserve">Senaryo 1: Mobil Güvenlik ve Davranış Analizi Platformu</w:t>
+      </w:r>
+    </w:p>
+    <w:p>
+      <w:pPr>
+        <w:spacing w:after="360"/>
+        <w:jc w:val="center"/>
+      </w:pPr>
+      <w:r>
+        <w:rPr>
+          <w:b/>
+          <w:bCs/>
+          <w:color w:val="1E3A8A"/>
+          <w:sz w:val="32"/>
+          <w:szCs w:val="32"/>
+        </w:rPr>
+        <w:t xml:space="preserve">GRUP 12</w:t>
       </w:r>
     </w:p>
     <w:tbl>

</xml_diff>